<commit_message>
Sinkron hal_13.png 1.5MB + hal_14.png 1.8MB — update REVISI_HAL13/14 image ref → hal_13.png/hal_14.png — docx 1.4MB/1.7MB — preview sync
Co-authored-by: arena-agent <297053741+arena-agent@users.noreply.github.com>
</commit_message>
<xml_diff>
--- a/REVISI_HAL13_ZAJR_QATHI_1_3.docx
+++ b/REVISI_HAL13_ZAJR_QATHI_1_3.docx
@@ -26,7 +26,7 @@
           <w:color w:val="C62828"/>
           <w:sz w:val="14"/>
         </w:rPr>
-        <w:t>✅ Revisi editor — sinkron scan 300 DPI — Hal13 1/3 — fa-ajābakum ‘anhu — khuddām — litatsqīfihi — wa’muri — Hal13 scan 300 DPI</w:t>
+        <w:t>✅ Revisi sinkron scan 300 DPI — hal_13.png / hal_14.png — terverifikasi</w:t>
       </w:r>
     </w:p>
     <w:p>
@@ -185,7 +185,7 @@
     <w:p>
       <w:r>
         <w:rPr>
-          <w:sz w:val="17"/>
+          <w:sz w:val="228600"/>
         </w:rPr>
         <w:t>Gertakan Pemutus untuk Mengambil Sumpah dan Janji atas Khādim Istinzāl:</w:t>
       </w:r>
@@ -193,7 +193,7 @@
     <w:p>
       <w:r>
         <w:rPr>
-          <w:sz w:val="17"/>
+          <w:sz w:val="228600"/>
         </w:rPr>
         <w:t>“Assalāmu‘alaikum warahmatullāhi wabarakātuh.</w:t>
       </w:r>
@@ -201,7 +201,7 @@
     <w:p>
       <w:r>
         <w:rPr>
-          <w:sz w:val="17"/>
+          <w:sz w:val="228600"/>
         </w:rPr>
         <w:t>Wahai saudara-saudaraku karena Allah, sering terjadi pada kalian bahwa kalian telah menggunakan suatu istinzāl (teknik menghadirkan khādim ghaib melalui perantara), lalu khādimnya hadir dan kalian bertanya kepadanya tentang suatu urusan, kemudian ia menjawab kalian *tentang urusan itu* namun ternyata apa yang dikatakannya kalian dapati sebagai kedustaan — [yaitu perantara anak kecil tersebut (ash-shabiyy)]. Keadaan seperti ini menimpa orang-orang yang melakukan istinzāl melalui perantara (al-wasīth) [yaitu anak kecil], dan mayoritas istinzāl-istinzāl seperti ini adalah dusta. Sebabnya ialah terkadang sang penuntut ilmu (ath-thālib) belum terlatih/mahir, dan terkadang ia telah berlebihan dalam melakukan istinzāl serta meminta para khādim dan menanyai mereka tentang perkara-perkara yang merendahkan kedudukan mereka. Khususnya apabila khādim tersebut tergolong ‘ulwiyy (luhur/atas), maka ia enggan untuk turun lalu masuk menggantikannya khādim suflī (bawah/rendah) yang pendusta — [yang dimaksud ‘ulwiyy di sini bukanlah isyarat kepada tujuh raja jin; mereka tidak akan pernah turun sama sekali kecuali dalam istinzāl nafsī rabbānī (istinzāl kejiwaan yang bersifat ketuhanan/rabbani)].</w:t>
       </w:r>
@@ -209,7 +209,7 @@
     <w:p>
       <w:r>
         <w:rPr>
-          <w:sz w:val="17"/>
+          <w:sz w:val="228600"/>
         </w:rPr>
         <w:t>Dan ini adalah faedah yang ampuh untuk menggertak para khādim istinzāl dan mendorong mereka agar berkata benar: Jangan beritahu sang penglihat (an-nāzhir) tentang apa yang hendak kamu lakukan agar kamu dapat memastikan kebenaran apa yang ia lihat. Setelah kamu melakukan istinzāl dan ia memberitahumu tentang kehadiran khādim, bacalah ayat berikut sebanyak **tujuh kali** dalam keadaan kamu **memegang dahi an-nāzhir untuk mengunci/menguatkannya (li-tatsqīfihi)**:</w:t>
       </w:r>
@@ -228,7 +228,7 @@
     <w:p>
       <w:r>
         <w:rPr>
-          <w:sz w:val="17"/>
+          <w:sz w:val="228600"/>
         </w:rPr>
         <w:t>Setelah itu, perintahkan ia (khādim melalui perantara) untuk mengucapkan dua kalimat syahadat dan shalawat kepada Nabi shallallāhu ‘alaihi wa sallam. Kemudian perintahkan ia untuk mendatangkan mushaf yang mulia dan membukanya pada **Surah al-Mujādalah**. Perintahkan an-nāzhir untuk mulai membaca surah tersebut agar kamu dapat memastikan bahwa yang terbuka memang surah itu. Setelah itu, perintahkan khādim untuk meletakkan tangan kanannya di atas mushaf tersebut dan berjanji kepadamu untuk berkata benar. **Jika ia menolak — padahal ia pasti akan melakukannya, tidak dapat tidak — maka gertaklah ia dengan gertakan pemutus (az-zajr al-qāthi‘) berikut ini:”</w:t>
       </w:r>
@@ -291,7 +291,7 @@
               <a:graphicData uri="http://schemas.openxmlformats.org/drawingml/2006/picture">
                 <pic:pic>
                   <pic:nvPicPr>
-                    <pic:cNvPr id="0" name="hal13_300dpi.png"/>
+                    <pic:cNvPr id="0" name="hal_13.png"/>
                     <pic:cNvPicPr/>
                   </pic:nvPicPr>
                   <pic:blipFill>

</xml_diff>